<commit_message>
Corrige l'ingestion des oeuvres reelles et regenere les types depuis le schema live
- scripts/convert-artworks.mjs : resout les noms de fichiers par comparaison
  Unicode normalisee (NFC/NFD) au lieu d'une correspondance litterale, les
  scans sources etant en NFD (Mac) alors que artworks.source.json est en NFC.
- Meme correctif de taille sur l'upload "original" (script d'ingestion et
  action admin d'upload) : la copie archivee est desormais plafonnee a
  4000px / JPEG qualite 92 plutot que le fichier brut, certains scans
  depassant la limite de taille d'upload Supabase Storage.
- src/types/database.types.ts regenere via `supabase gen types` contre le
  projet Supabase reellement lie (remplace la version ecrite a la main).

Les 8 oeuvres reelles sont maintenant en base (brouillon, non publiees).

Co-Authored-By: Claude Sonnet 5 <noreply@anthropic.com>
</commit_message>
<xml_diff>
--- a/Prompt.docx
+++ b/Prompt.docx
@@ -2,6 +2,231 @@
 <file path=word/document.xml><?xml version="1.0" encoding="utf-8"?>
 <w:document xmlns:wpc="http://schemas.microsoft.com/office/word/2010/wordprocessingCanvas" xmlns:cx="http://schemas.microsoft.com/office/drawing/2014/chartex" xmlns:cx1="http://schemas.microsoft.com/office/drawing/2015/9/8/chartex" xmlns:cx2="http://schemas.microsoft.com/office/drawing/2015/10/21/chartex" xmlns:cx3="http://schemas.microsoft.com/office/drawing/2016/5/9/chartex" xmlns:cx4="http://schemas.microsoft.com/office/drawing/2016/5/10/chartex" xmlns:cx5="http://schemas.microsoft.com/office/drawing/2016/5/11/chartex" xmlns:cx6="http://schemas.microsoft.com/office/drawing/2016/5/12/chartex" xmlns:cx7="http://schemas.microsoft.com/office/drawing/2016/5/13/chartex" xmlns:cx8="http://schemas.microsoft.com/office/drawing/2016/5/14/chartex" xmlns:mc="http://schemas.openxmlformats.org/markup-compatibility/2006" xmlns:aink="http://schemas.microsoft.com/office/drawing/2016/ink" xmlns:am3d="http://schemas.microsoft.com/office/drawing/2017/model3d" xmlns:o="urn:schemas-microsoft-com:office:office" xmlns:oel="http://schemas.microsoft.com/office/2019/extlst" xmlns:r="http://schemas.openxmlformats.org/officeDocument/2006/relationships" xmlns:m="http://schemas.openxmlformats.org/officeDocument/2006/math" xmlns:v="urn:schemas-microsoft-com:vml" xmlns:wp14="http://schemas.microsoft.com/office/word/2010/wordprocessingDrawing" xmlns:wp="http://schemas.openxmlformats.org/drawingml/2006/wordprocessingDrawing" xmlns:w10="urn:schemas-microsoft-com:office:word" xmlns:w="http://schemas.openxmlformats.org/wordprocessingml/2006/main" xmlns:w14="http://schemas.microsoft.com/office/word/2010/wordml" xmlns:w15="http://schemas.microsoft.com/office/word/2012/wordml" xmlns:w16cei="http://schemas.microsoft.com/office/word/2026/wordml/cei" xmlns:w16cex="http://schemas.microsoft.com/office/word/2018/wordml/cex" xmlns:w16cid="http://schemas.microsoft.com/office/word/2016/wordml/cid" xmlns:w16="http://schemas.microsoft.com/office/word/2018/wordml" xmlns:w16du="http://schemas.microsoft.com/office/word/2023/wordml/word16du" xmlns:w16sdtdh="http://schemas.microsoft.com/office/word/2020/wordml/sdtdatahash" xmlns:w16sdtfl="http://schemas.microsoft.com/office/word/2024/wordml/sdtformatlock" xmlns:w16se="http://schemas.microsoft.com/office/word/2015/wordml/symex" xmlns:wpg="http://schemas.microsoft.com/office/word/2010/wordprocessingGroup" xmlns:wpi="http://schemas.microsoft.com/office/word/2010/wordprocessingInk" xmlns:wne="http://schemas.microsoft.com/office/word/2006/wordml" xmlns:wps="http://schemas.microsoft.com/office/word/2010/wordprocessingShape" mc:Ignorable="w14 w15 w16se w16cid w16 w16cex w16sdtdh w16sdtfl w16du wp14">
   <w:body>
+    <w:p>
+      <w:pPr>
+        <w:spacing w:before="100" w:beforeAutospacing="1" w:after="100" w:afterAutospacing="1" w:line="240" w:lineRule="auto"/>
+        <w:outlineLvl w:val="0"/>
+        <w:rPr>
+          <w:rFonts w:ascii="Times New Roman" w:eastAsia="Times New Roman" w:hAnsi="Times New Roman" w:cs="Times New Roman"/>
+          <w:b/>
+          <w:bCs/>
+          <w:color w:val="156082" w:themeColor="accent1"/>
+          <w:kern w:val="36"/>
+          <w14:ligatures w14:val="none"/>
+        </w:rPr>
+      </w:pPr>
+      <w:proofErr w:type="spellStart"/>
+      <w:r>
+        <w:rPr>
+          <w:rFonts w:ascii="Times New Roman" w:eastAsia="Times New Roman" w:hAnsi="Times New Roman" w:cs="Times New Roman"/>
+          <w:b/>
+          <w:bCs/>
+          <w:color w:val="156082" w:themeColor="accent1"/>
+          <w:kern w:val="36"/>
+          <w14:ligatures w14:val="none"/>
+        </w:rPr>
+        <w:t>Subscription</w:t>
+      </w:r>
+      <w:proofErr w:type="spellEnd"/>
+      <w:r>
+        <w:rPr>
+          <w:rFonts w:ascii="Times New Roman" w:eastAsia="Times New Roman" w:hAnsi="Times New Roman" w:cs="Times New Roman"/>
+          <w:b/>
+          <w:bCs/>
+          <w:color w:val="156082" w:themeColor="accent1"/>
+          <w:kern w:val="36"/>
+          <w14:ligatures w14:val="none"/>
+        </w:rPr>
+        <w:t xml:space="preserve"> </w:t>
+      </w:r>
+      <w:proofErr w:type="spellStart"/>
+      <w:r>
+        <w:rPr>
+          <w:rFonts w:ascii="Times New Roman" w:eastAsia="Times New Roman" w:hAnsi="Times New Roman" w:cs="Times New Roman"/>
+          <w:b/>
+          <w:bCs/>
+          <w:color w:val="156082" w:themeColor="accent1"/>
+          <w:kern w:val="36"/>
+          <w14:ligatures w14:val="none"/>
+        </w:rPr>
+        <w:t>Supabase</w:t>
+      </w:r>
+      <w:proofErr w:type="spellEnd"/>
+      <w:r>
+        <w:rPr>
+          <w:rFonts w:ascii="Times New Roman" w:eastAsia="Times New Roman" w:hAnsi="Times New Roman" w:cs="Times New Roman"/>
+          <w:b/>
+          <w:bCs/>
+          <w:color w:val="156082" w:themeColor="accent1"/>
+          <w:kern w:val="36"/>
+          <w14:ligatures w14:val="none"/>
+        </w:rPr>
+        <w:t xml:space="preserve"> : </w:t>
+      </w:r>
+      <w:r>
+        <w:rPr>
+          <w:rFonts w:ascii="Times New Roman" w:eastAsia="Times New Roman" w:hAnsi="Times New Roman" w:cs="Times New Roman"/>
+          <w:b/>
+          <w:bCs/>
+          <w:color w:val="156082" w:themeColor="accent1"/>
+          <w:kern w:val="36"/>
+          <w14:ligatures w14:val="none"/>
+        </w:rPr>
+        <w:t>$</w:t>
+      </w:r>
+      <w:r>
+        <w:rPr>
+          <w:rFonts w:ascii="Times New Roman" w:eastAsia="Times New Roman" w:hAnsi="Times New Roman" w:cs="Times New Roman"/>
+          <w:b/>
+          <w:bCs/>
+          <w:color w:val="156082" w:themeColor="accent1"/>
+          <w:kern w:val="36"/>
+          <w14:ligatures w14:val="none"/>
+        </w:rPr>
+        <w:t>26.50</w:t>
+      </w:r>
+      <w:r>
+        <w:rPr>
+          <w:rFonts w:ascii="Times New Roman" w:eastAsia="Times New Roman" w:hAnsi="Times New Roman" w:cs="Times New Roman"/>
+          <w:b/>
+          <w:bCs/>
+          <w:color w:val="156082" w:themeColor="accent1"/>
+          <w:kern w:val="36"/>
+          <w14:ligatures w14:val="none"/>
+        </w:rPr>
+        <w:t xml:space="preserve"> </w:t>
+      </w:r>
+      <w:r>
+        <w:rPr>
+          <w:rFonts w:ascii="Times New Roman" w:eastAsia="Times New Roman" w:hAnsi="Times New Roman" w:cs="Times New Roman"/>
+          <w:b/>
+          <w:bCs/>
+          <w:color w:val="156082" w:themeColor="accent1"/>
+          <w:kern w:val="36"/>
+          <w14:ligatures w14:val="none"/>
+        </w:rPr>
+        <w:t>–</w:t>
+      </w:r>
+      <w:r>
+        <w:rPr>
+          <w:rFonts w:ascii="Times New Roman" w:eastAsia="Times New Roman" w:hAnsi="Times New Roman" w:cs="Times New Roman"/>
+          <w:b/>
+          <w:bCs/>
+          <w:color w:val="156082" w:themeColor="accent1"/>
+          <w:kern w:val="36"/>
+          <w14:ligatures w14:val="none"/>
+        </w:rPr>
+        <w:t xml:space="preserve"> </w:t>
+      </w:r>
+      <w:proofErr w:type="spellStart"/>
+      <w:r>
+        <w:rPr>
+          <w:rFonts w:ascii="Times New Roman" w:eastAsia="Times New Roman" w:hAnsi="Times New Roman" w:cs="Times New Roman"/>
+          <w:b/>
+          <w:bCs/>
+          <w:color w:val="156082" w:themeColor="accent1"/>
+          <w:kern w:val="36"/>
+          <w14:ligatures w14:val="none"/>
+        </w:rPr>
+        <w:t>Starte</w:t>
+      </w:r>
+      <w:r>
+        <w:rPr>
+          <w:rFonts w:ascii="Times New Roman" w:eastAsia="Times New Roman" w:hAnsi="Times New Roman" w:cs="Times New Roman"/>
+          <w:b/>
+          <w:bCs/>
+          <w:color w:val="156082" w:themeColor="accent1"/>
+          <w:kern w:val="36"/>
+          <w14:ligatures w14:val="none"/>
+        </w:rPr>
+        <w:t>d</w:t>
+      </w:r>
+      <w:proofErr w:type="spellEnd"/>
+      <w:r>
+        <w:rPr>
+          <w:rFonts w:ascii="Times New Roman" w:eastAsia="Times New Roman" w:hAnsi="Times New Roman" w:cs="Times New Roman"/>
+          <w:b/>
+          <w:bCs/>
+          <w:color w:val="156082" w:themeColor="accent1"/>
+          <w:kern w:val="36"/>
+          <w14:ligatures w14:val="none"/>
+        </w:rPr>
+        <w:t xml:space="preserve"> August 3, 2026</w:t>
+      </w:r>
+    </w:p>
+    <w:p>
+      <w:pPr>
+        <w:spacing w:before="100" w:beforeAutospacing="1" w:after="100" w:afterAutospacing="1" w:line="240" w:lineRule="auto"/>
+        <w:outlineLvl w:val="0"/>
+        <w:rPr>
+          <w:rFonts w:ascii="Times New Roman" w:eastAsia="Times New Roman" w:hAnsi="Times New Roman" w:cs="Times New Roman"/>
+          <w:b/>
+          <w:bCs/>
+          <w:color w:val="156082" w:themeColor="accent1"/>
+          <w:kern w:val="36"/>
+          <w14:ligatures w14:val="none"/>
+        </w:rPr>
+      </w:pPr>
+      <w:proofErr w:type="spellStart"/>
+      <w:r>
+        <w:rPr>
+          <w:rFonts w:ascii="Times New Roman" w:eastAsia="Times New Roman" w:hAnsi="Times New Roman" w:cs="Times New Roman"/>
+          <w:b/>
+          <w:bCs/>
+          <w:color w:val="156082" w:themeColor="accent1"/>
+          <w:kern w:val="36"/>
+          <w14:ligatures w14:val="none"/>
+        </w:rPr>
+        <w:t>Password</w:t>
+      </w:r>
+      <w:proofErr w:type="spellEnd"/>
+      <w:r>
+        <w:rPr>
+          <w:rFonts w:ascii="Times New Roman" w:eastAsia="Times New Roman" w:hAnsi="Times New Roman" w:cs="Times New Roman"/>
+          <w:b/>
+          <w:bCs/>
+          <w:color w:val="156082" w:themeColor="accent1"/>
+          <w:kern w:val="36"/>
+          <w14:ligatures w14:val="none"/>
+        </w:rPr>
+        <w:t xml:space="preserve"> </w:t>
+      </w:r>
+      <w:proofErr w:type="spellStart"/>
+      <w:r>
+        <w:rPr>
+          <w:rFonts w:ascii="Times New Roman" w:eastAsia="Times New Roman" w:hAnsi="Times New Roman" w:cs="Times New Roman"/>
+          <w:b/>
+          <w:bCs/>
+          <w:color w:val="156082" w:themeColor="accent1"/>
+          <w:kern w:val="36"/>
+          <w14:ligatures w14:val="none"/>
+        </w:rPr>
+        <w:t>Supabase</w:t>
+      </w:r>
+      <w:proofErr w:type="spellEnd"/>
+      <w:r>
+        <w:rPr>
+          <w:rFonts w:ascii="Times New Roman" w:eastAsia="Times New Roman" w:hAnsi="Times New Roman" w:cs="Times New Roman"/>
+          <w:b/>
+          <w:bCs/>
+          <w:color w:val="156082" w:themeColor="accent1"/>
+          <w:kern w:val="36"/>
+          <w14:ligatures w14:val="none"/>
+        </w:rPr>
+        <w:t xml:space="preserve"> : </w:t>
+      </w:r>
+      <w:r>
+        <w:rPr>
+          <w:rFonts w:ascii="Times New Roman" w:eastAsia="Times New Roman" w:hAnsi="Times New Roman" w:cs="Times New Roman"/>
+          <w:b/>
+          <w:bCs/>
+          <w:color w:val="156082" w:themeColor="accent1"/>
+          <w:kern w:val="36"/>
+          <w14:ligatures w14:val="none"/>
+        </w:rPr>
+        <w:t>Sidiya&amp;Aminata$2001s</w:t>
+      </w:r>
+    </w:p>
     <w:p>
       <w:pPr>
         <w:spacing w:before="100" w:beforeAutospacing="1" w:after="100" w:afterAutospacing="1" w:line="240" w:lineRule="auto"/>
@@ -706,6 +931,7 @@
           <w:kern w:val="0"/>
           <w14:ligatures w14:val="none"/>
         </w:rPr>
+        <w:lastRenderedPageBreak/>
         <w:t>GitHub</w:t>
       </w:r>
     </w:p>
@@ -810,7 +1036,6 @@
           <w:kern w:val="0"/>
           <w14:ligatures w14:val="none"/>
         </w:rPr>
-        <w:lastRenderedPageBreak/>
         <w:t>Le code devra être :</w:t>
       </w:r>
     </w:p>
@@ -1435,6 +1660,7 @@
           <w:kern w:val="0"/>
           <w14:ligatures w14:val="none"/>
         </w:rPr>
+        <w:lastRenderedPageBreak/>
         <w:t>recherche</w:t>
       </w:r>
       <w:proofErr w:type="gramEnd"/>
@@ -1590,7 +1816,6 @@
           <w:kern w:val="0"/>
           <w14:ligatures w14:val="none"/>
         </w:rPr>
-        <w:lastRenderedPageBreak/>
         <w:pict w14:anchorId="0CFF422B">
           <v:rect id="_x0000_i1028" style="width:0;height:1.5pt" o:hralign="center" o:hrstd="t" o:hr="t" fillcolor="#a0a0a0" stroked="f"/>
         </w:pict>
@@ -2182,6 +2407,7 @@
           <w:kern w:val="0"/>
           <w14:ligatures w14:val="none"/>
         </w:rPr>
+        <w:lastRenderedPageBreak/>
         <w:pict w14:anchorId="2CDBE873">
           <v:rect id="_x0000_i1030" style="width:0;height:1.5pt" o:hralign="center" o:hrstd="t" o:hr="t" fillcolor="#a0a0a0" stroked="f"/>
         </w:pict>
@@ -2229,7 +2455,6 @@
           <w:kern w:val="0"/>
           <w14:ligatures w14:val="none"/>
         </w:rPr>
-        <w:lastRenderedPageBreak/>
         <w:t xml:space="preserve">Utiliser </w:t>
       </w:r>
       <w:proofErr w:type="spellStart"/>
@@ -3015,6 +3240,7 @@
           <w:kern w:val="0"/>
           <w14:ligatures w14:val="none"/>
         </w:rPr>
+        <w:lastRenderedPageBreak/>
         <w:t>élégant</w:t>
       </w:r>
       <w:proofErr w:type="gramEnd"/>
@@ -3138,7 +3364,6 @@
           <w:kern w:val="0"/>
           <w14:ligatures w14:val="none"/>
         </w:rPr>
-        <w:lastRenderedPageBreak/>
         <w:t>Prévoir :</w:t>
       </w:r>
     </w:p>
@@ -3863,6 +4088,7 @@
           <w:kern w:val="0"/>
           <w14:ligatures w14:val="none"/>
         </w:rPr>
+        <w:lastRenderedPageBreak/>
         <w:t>orders</w:t>
       </w:r>
       <w:proofErr w:type="spellEnd"/>
@@ -3990,7 +4216,6 @@
           <w:kern w:val="0"/>
           <w14:ligatures w14:val="none"/>
         </w:rPr>
-        <w:lastRenderedPageBreak/>
         <w:t>les</w:t>
       </w:r>
       <w:proofErr w:type="gramEnd"/>
@@ -4719,6 +4944,7 @@
           <w:szCs w:val="48"/>
           <w14:ligatures w14:val="none"/>
         </w:rPr>
+        <w:lastRenderedPageBreak/>
         <w:t>Performance</w:t>
       </w:r>
     </w:p>
@@ -4852,7 +5078,6 @@
           <w:kern w:val="0"/>
           <w14:ligatures w14:val="none"/>
         </w:rPr>
-        <w:lastRenderedPageBreak/>
         <w:t>optimisation</w:t>
       </w:r>
       <w:proofErr w:type="gramEnd"/>
@@ -5609,6 +5834,7 @@
           <w:kern w:val="0"/>
           <w14:ligatures w14:val="none"/>
         </w:rPr>
+        <w:lastRenderedPageBreak/>
         <w:t>propre</w:t>
       </w:r>
       <w:proofErr w:type="gramEnd"/>
@@ -5788,7 +6014,6 @@
           <w:kern w:val="0"/>
           <w14:ligatures w14:val="none"/>
         </w:rPr>
-        <w:lastRenderedPageBreak/>
         <w:t>Respecter les principes :</w:t>
       </w:r>
     </w:p>

</xml_diff>